<commit_message>
Two-person team: Ismail El Ktiri El Idrissi and Abir Chowdhury, in the README, documentation and Devpost text
Co-Authored-By: Claude Opus 5.5 <noreply@anthropic.com>
</commit_message>
<xml_diff>
--- a/docs/CrowdPulse-documentation.docx
+++ b/docs/CrowdPulse-documentation.docx
@@ -125,23 +125,23 @@
               <w:rPr>
                 <w:sz w:val="19"/>
               </w:rPr>
-              <w:t xml:space="preserve">Built by</w:t>
-            </w:r>
-          </w:p>
-        </w:tc>
-        <w:tc>
-          <w:tcPr>
-            <w:tcW w:w="4500" w:type="dxa"/>
-          </w:tcPr>
-          <w:p>
-            <w:pPr>
-              <w:spacing w:before="40" w:after="40"/>
-            </w:pPr>
-            <w:r>
-              <w:rPr>
-                <w:sz w:val="19"/>
-              </w:rPr>
-              <w:t xml:space="preserve">Ismail (GitHub: Ithugg)</w:t>
+              <w:t xml:space="preserve">Team</w:t>
+            </w:r>
+          </w:p>
+        </w:tc>
+        <w:tc>
+          <w:tcPr>
+            <w:tcW w:w="4500" w:type="dxa"/>
+          </w:tcPr>
+          <w:p>
+            <w:pPr>
+              <w:spacing w:before="40" w:after="40"/>
+            </w:pPr>
+            <w:r>
+              <w:rPr>
+                <w:sz w:val="19"/>
+              </w:rPr>
+              <w:t xml:space="preserve">Ismail El Ktiri El Idrissi and Abir Chowdhury</w:t>
             </w:r>
           </w:p>
         </w:tc>
@@ -2383,7 +2383,7 @@
       </w:r>
       <w:r>
         <w:rPr/>
-        <w:t xml:space="preserve"> The first version had zone areas typed into a config file, and the densities were whatever I made them. I threw that out and wrote the self-calibration. It is the part I am proudest of and the part that took longest.</w:t>
+        <w:t xml:space="preserve"> The first version had zone areas typed into a config file, and the densities were whatever we made them. We threw that out and wrote the self-calibration. It is the part we are proudest of and the part that took longest.</w:t>
       </w:r>
     </w:p>
     <w:p>
@@ -2396,20 +2396,20 @@
       </w:r>
       <w:r>
         <w:rPr/>
-        <w:t xml:space="preserve"> With real measurements, none of the footage is dangerous. It was tempting to scale the numbers until something turned red. I did not, and built the labelled drill instead.</w:t>
-      </w:r>
-    </w:p>
-    <w:p>
-      <w:pPr/>
-      <w:r>
-        <w:rPr>
-          <w:b/>
-        </w:rPr>
-        <w:t xml:space="preserve">Checking my own sources.</w:t>
-      </w:r>
-      <w:r>
-        <w:rPr/>
-        <w:t xml:space="preserve"> Two things in my notes turned out to be wrong when I went back to the papers: the UK Green Guide does not give 4/m² as a "safe limit" (its figure is 4.7 for standing areas), and I could not find a published "6-minute rule". Both are fixed in the app and the README.</w:t>
+        <w:t xml:space="preserve"> With real measurements, none of the footage is dangerous. It was tempting to scale the numbers until something turned red. We did not, and built the labelled drill instead.</w:t>
+      </w:r>
+    </w:p>
+    <w:p>
+      <w:pPr/>
+      <w:r>
+        <w:rPr>
+          <w:b/>
+        </w:rPr>
+        <w:t xml:space="preserve">Checking our own sources.</w:t>
+      </w:r>
+      <w:r>
+        <w:rPr/>
+        <w:t xml:space="preserve"> Two things in our notes turned out to be wrong when we went back to the papers: the UK Green Guide does not give 4/m² as a "safe limit" (its figure is 4.7 for standing areas), and we could not find a published "6-minute rule". Both are fixed in the app and the README.</w:t>
       </w:r>
     </w:p>
     <w:p>
@@ -2431,7 +2431,7 @@
         <w:rPr>
           <w:b/>
         </w:rPr>
-        <w:t xml:space="preserve">What I learned.</w:t>
+        <w:t xml:space="preserve">What we learned.</w:t>
       </w:r>
       <w:r>
         <w:rPr/>

</xml_diff>

<commit_message>
Link the submitted Devpost page from the README and the documentation
Co-Authored-By: Claude Opus 5.5 <noreply@anthropic.com>
</commit_message>
<xml_diff>
--- a/docs/CrowdPulse-documentation.docx
+++ b/docs/CrowdPulse-documentation.docx
@@ -234,6 +234,40 @@
               <w:rPr>
                 <w:sz w:val="19"/>
               </w:rPr>
+              <w:t xml:space="preserve">Devpost page</w:t>
+            </w:r>
+          </w:p>
+        </w:tc>
+        <w:tc>
+          <w:tcPr>
+            <w:tcW w:w="4500" w:type="dxa"/>
+          </w:tcPr>
+          <w:p>
+            <w:pPr>
+              <w:spacing w:before="40" w:after="40"/>
+            </w:pPr>
+            <w:r>
+              <w:rPr>
+                <w:sz w:val="19"/>
+              </w:rPr>
+              <w:t xml:space="preserve">https://devpost.com/software/crowdpulse-w4y3pj</w:t>
+            </w:r>
+          </w:p>
+        </w:tc>
+      </w:tr>
+      <w:tr>
+        <w:tc>
+          <w:tcPr>
+            <w:tcW w:w="4500" w:type="dxa"/>
+          </w:tcPr>
+          <w:p>
+            <w:pPr>
+              <w:spacing w:before="40" w:after="40"/>
+            </w:pPr>
+            <w:r>
+              <w:rPr>
+                <w:sz w:val="19"/>
+              </w:rPr>
               <w:t xml:space="preserve">Demo video</w:t>
             </w:r>
           </w:p>
@@ -250,7 +284,7 @@
               <w:rPr>
                 <w:sz w:val="19"/>
               </w:rPr>
-              <w:t xml:space="preserve">Linked from the Devpost project page (2 minutes 19 seconds)</w:t>
+              <w:t xml:space="preserve">At the top of the Devpost page (2 minutes 19 seconds)</w:t>
             </w:r>
           </w:p>
         </w:tc>

</xml_diff>